<commit_message>
Update resume to Fall 2026 version
</commit_message>
<xml_diff>
--- a/Cayleigh_Haag_CS_Resume.docx
+++ b/Cayleigh_Haag_CS_Resume.docx
@@ -1,6 +1,6 @@
 
 <file path=word/document.xml><?xml version="1.0" encoding="utf-8"?>
-<w:document xmlns:wpc="http://schemas.microsoft.com/office/word/2010/wordprocessingCanvas" xmlns:cx="http://schemas.microsoft.com/office/drawing/2014/chartex" xmlns:cx1="http://schemas.microsoft.com/office/drawing/2015/9/8/chartex" xmlns:cx2="http://schemas.microsoft.com/office/drawing/2015/10/21/chartex" xmlns:cx3="http://schemas.microsoft.com/office/drawing/2016/5/9/chartex" xmlns:cx4="http://schemas.microsoft.com/office/drawing/2016/5/10/chartex" xmlns:cx5="http://schemas.microsoft.com/office/drawing/2016/5/11/chartex" xmlns:cx6="http://schemas.microsoft.com/office/drawing/2016/5/12/chartex" xmlns:cx7="http://schemas.microsoft.com/office/drawing/2016/5/13/chartex" xmlns:cx8="http://schemas.microsoft.com/office/drawing/2016/5/14/chartex" xmlns:mc="http://schemas.openxmlformats.org/markup-compatibility/2006" xmlns:aink="http://schemas.microsoft.com/office/drawing/2016/ink" xmlns:am3d="http://schemas.microsoft.com/office/drawing/2017/model3d" xmlns:o="urn:schemas-microsoft-com:office:office" xmlns:oel="http://schemas.microsoft.com/office/2019/extlst" xmlns:r="http://schemas.openxmlformats.org/officeDocument/2006/relationships" xmlns:m="http://schemas.openxmlformats.org/officeDocument/2006/math" xmlns:v="urn:schemas-microsoft-com:vml" xmlns:wp14="http://schemas.microsoft.com/office/word/2010/wordprocessingDrawing" xmlns:wp="http://schemas.openxmlformats.org/drawingml/2006/wordprocessingDrawing" xmlns:w10="urn:schemas-microsoft-com:office:word" xmlns:w="http://schemas.openxmlformats.org/wordprocessingml/2006/main" xmlns:w14="http://schemas.microsoft.com/office/word/2010/wordml" xmlns:w15="http://schemas.microsoft.com/office/word/2012/wordml" xmlns:w16cex="http://schemas.microsoft.com/office/word/2018/wordml/cex" xmlns:w16cid="http://schemas.microsoft.com/office/word/2016/wordml/cid" xmlns:w16="http://schemas.microsoft.com/office/word/2018/wordml" xmlns:w16du="http://schemas.microsoft.com/office/word/2023/wordml/word16du" xmlns:w16sdtdh="http://schemas.microsoft.com/office/word/2020/wordml/sdtdatahash" xmlns:w16sdtfl="http://schemas.microsoft.com/office/word/2024/wordml/sdtformatlock" xmlns:w16se="http://schemas.microsoft.com/office/word/2015/wordml/symex" xmlns:wpg="http://schemas.microsoft.com/office/word/2010/wordprocessingGroup" xmlns:wpi="http://schemas.microsoft.com/office/word/2010/wordprocessingInk" xmlns:wne="http://schemas.microsoft.com/office/word/2006/wordml" xmlns:wps="http://schemas.microsoft.com/office/word/2010/wordprocessingShape" mc:Ignorable="w14 w15 w16se w16cid w16 w16cex w16sdtdh w16sdtfl w16du wp14">
+<w:document xmlns:wpc="http://schemas.microsoft.com/office/word/2010/wordprocessingCanvas" xmlns:cx="http://schemas.microsoft.com/office/drawing/2014/chartex" xmlns:cx1="http://schemas.microsoft.com/office/drawing/2015/9/8/chartex" xmlns:cx2="http://schemas.microsoft.com/office/drawing/2015/10/21/chartex" xmlns:cx3="http://schemas.microsoft.com/office/drawing/2016/5/9/chartex" xmlns:cx4="http://schemas.microsoft.com/office/drawing/2016/5/10/chartex" xmlns:cx5="http://schemas.microsoft.com/office/drawing/2016/5/11/chartex" xmlns:cx6="http://schemas.microsoft.com/office/drawing/2016/5/12/chartex" xmlns:cx7="http://schemas.microsoft.com/office/drawing/2016/5/13/chartex" xmlns:cx8="http://schemas.microsoft.com/office/drawing/2016/5/14/chartex" xmlns:mc="http://schemas.openxmlformats.org/markup-compatibility/2006" xmlns:m="http://schemas.openxmlformats.org/officeDocument/2006/math" xmlns:aink="http://schemas.microsoft.com/office/drawing/2016/ink" xmlns:am3d="http://schemas.microsoft.com/office/drawing/2017/model3d" xmlns:oel="http://schemas.microsoft.com/office/2019/extlst" xmlns:r="http://schemas.openxmlformats.org/officeDocument/2006/relationships" xmlns:wp14="http://schemas.microsoft.com/office/word/2010/wordprocessingDrawing" xmlns:wp="http://schemas.openxmlformats.org/drawingml/2006/wordprocessingDrawing" xmlns:wpg="http://schemas.microsoft.com/office/word/2010/wordprocessingGroup" xmlns:wpi="http://schemas.microsoft.com/office/word/2010/wordprocessingInk" xmlns:wps="http://schemas.microsoft.com/office/word/2010/wordprocessingShape" xmlns:o="urn:schemas-microsoft-com:office:office" xmlns:v="urn:schemas-microsoft-com:vml" xmlns:w10="urn:schemas-microsoft-com:office:word" xmlns:w="http://schemas.openxmlformats.org/wordprocessingml/2006/main" xmlns:w14="http://schemas.microsoft.com/office/word/2010/wordml" xmlns:w15="http://schemas.microsoft.com/office/word/2012/wordml" xmlns:w16cex="http://schemas.microsoft.com/office/word/2018/wordml/cex" xmlns:w16cid="http://schemas.microsoft.com/office/word/2016/wordml/cid" xmlns:w16="http://schemas.microsoft.com/office/word/2018/wordml" xmlns:w16sdtdh="http://schemas.microsoft.com/office/word/2020/wordml/sdtdatahash" xmlns:w16sdtfl="http://schemas.microsoft.com/office/word/2024/wordml/sdtformatlock" xmlns:w16se="http://schemas.microsoft.com/office/word/2015/wordml/symex" xmlns:w16du="http://schemas.microsoft.com/office/word/2023/wordml/word16du" xmlns:wne="http://schemas.microsoft.com/office/word/2006/wordml" mc:Ignorable="w14 w15 w16se w16cid w16 w16cex w16sdtdh w16sdtfl w16du wp14">
   <w:body>
     <w:p>
       <w:pPr>
@@ -35,7 +35,31 @@
           <w:color w:val="000000" w:themeColor="text1"/>
           <w:sz w:val="24"/>
         </w:rPr>
-        <w:t>Undergraduate Student – Computer Science</w:t>
+        <w:t xml:space="preserve">Student </w:t>
+      </w:r>
+      <w:r>
+        <w:rPr>
+          <w:rFonts w:asciiTheme="majorHAnsi" w:hAnsiTheme="majorHAnsi" w:cstheme="majorHAnsi"/>
+          <w:b/>
+          <w:color w:val="000000" w:themeColor="text1"/>
+        </w:rPr>
+        <w:t xml:space="preserve"> – </w:t>
+      </w:r>
+      <w:r>
+        <w:rPr>
+          <w:rFonts w:asciiTheme="majorHAnsi" w:hAnsiTheme="majorHAnsi" w:cstheme="majorHAnsi"/>
+          <w:color w:val="000000" w:themeColor="text1"/>
+          <w:sz w:val="24"/>
+        </w:rPr>
+        <w:t xml:space="preserve"> </w:t>
+      </w:r>
+      <w:r>
+        <w:rPr>
+          <w:rFonts w:asciiTheme="majorHAnsi" w:hAnsiTheme="majorHAnsi" w:cstheme="majorHAnsi"/>
+          <w:color w:val="000000" w:themeColor="text1"/>
+          <w:sz w:val="24"/>
+        </w:rPr>
+        <w:t>Computer Science</w:t>
       </w:r>
       <w:r>
         <w:rPr>
@@ -129,7 +153,9 @@
         <w:spacing w:line="240" w:lineRule="auto"/>
         <w:rPr>
           <w:rFonts w:asciiTheme="majorHAnsi" w:hAnsiTheme="majorHAnsi" w:cstheme="majorHAnsi"/>
+          <w:b/>
           <w:color w:val="000000" w:themeColor="text1"/>
+          <w:sz w:val="26"/>
         </w:rPr>
       </w:pPr>
       <w:r>
@@ -156,6 +182,90 @@
           <w:b/>
           <w:color w:val="000000" w:themeColor="text1"/>
         </w:rPr>
+        <w:t>Stanford University</w:t>
+      </w:r>
+      <w:r>
+        <w:rPr>
+          <w:rFonts w:asciiTheme="majorHAnsi" w:hAnsiTheme="majorHAnsi" w:cstheme="majorHAnsi"/>
+          <w:b/>
+          <w:color w:val="000000" w:themeColor="text1"/>
+        </w:rPr>
+        <w:t xml:space="preserve"> – </w:t>
+      </w:r>
+      <w:r>
+        <w:rPr>
+          <w:rFonts w:asciiTheme="majorHAnsi" w:hAnsiTheme="majorHAnsi" w:cstheme="majorHAnsi"/>
+          <w:b/>
+          <w:color w:val="000000" w:themeColor="text1"/>
+        </w:rPr>
+        <w:t>Class of 2027</w:t>
+      </w:r>
+    </w:p>
+    <w:p>
+      <w:pPr>
+        <w:spacing w:line="240" w:lineRule="auto"/>
+        <w:rPr>
+          <w:rFonts w:asciiTheme="majorHAnsi" w:hAnsiTheme="majorHAnsi" w:cstheme="majorHAnsi"/>
+          <w:color w:val="000000" w:themeColor="text1"/>
+        </w:rPr>
+      </w:pPr>
+      <w:r>
+        <w:rPr>
+          <w:rFonts w:asciiTheme="majorHAnsi" w:hAnsiTheme="majorHAnsi" w:cstheme="majorHAnsi"/>
+          <w:color w:val="000000" w:themeColor="text1"/>
+        </w:rPr>
+        <w:t>Master of Science</w:t>
+      </w:r>
+      <w:r>
+        <w:rPr>
+          <w:rFonts w:asciiTheme="majorHAnsi" w:hAnsiTheme="majorHAnsi" w:cstheme="majorHAnsi"/>
+          <w:color w:val="000000" w:themeColor="text1"/>
+        </w:rPr>
+        <w:t>, Computer Science (AI) |</w:t>
+      </w:r>
+      <w:r>
+        <w:rPr>
+          <w:rFonts w:asciiTheme="majorHAnsi" w:hAnsiTheme="majorHAnsi" w:cstheme="majorHAnsi"/>
+          <w:color w:val="000000" w:themeColor="text1"/>
+        </w:rPr>
+        <w:t xml:space="preserve"> </w:t>
+      </w:r>
+      <w:r>
+        <w:rPr>
+          <w:rFonts w:asciiTheme="majorHAnsi" w:hAnsiTheme="majorHAnsi" w:cstheme="majorHAnsi"/>
+          <w:color w:val="000000" w:themeColor="text1"/>
+        </w:rPr>
+        <w:t>GPA: 3.9</w:t>
+      </w:r>
+      <w:r>
+        <w:rPr>
+          <w:rFonts w:asciiTheme="majorHAnsi" w:hAnsiTheme="majorHAnsi" w:cstheme="majorHAnsi"/>
+          <w:color w:val="000000" w:themeColor="text1"/>
+        </w:rPr>
+        <w:t>2</w:t>
+      </w:r>
+      <w:r>
+        <w:rPr>
+          <w:rFonts w:asciiTheme="majorHAnsi" w:hAnsiTheme="majorHAnsi" w:cstheme="majorHAnsi"/>
+          <w:color w:val="000000" w:themeColor="text1"/>
+        </w:rPr>
+        <w:t>/4.0</w:t>
+      </w:r>
+    </w:p>
+    <w:p>
+      <w:pPr>
+        <w:spacing w:line="240" w:lineRule="auto"/>
+        <w:rPr>
+          <w:rFonts w:asciiTheme="majorHAnsi" w:hAnsiTheme="majorHAnsi" w:cstheme="majorHAnsi"/>
+          <w:color w:val="000000" w:themeColor="text1"/>
+        </w:rPr>
+      </w:pPr>
+      <w:r>
+        <w:rPr>
+          <w:rFonts w:asciiTheme="majorHAnsi" w:hAnsiTheme="majorHAnsi" w:cstheme="majorHAnsi"/>
+          <w:b/>
+          <w:color w:val="000000" w:themeColor="text1"/>
+        </w:rPr>
         <w:t>Stanford University – Class of 2027</w:t>
       </w:r>
     </w:p>
@@ -179,7 +289,21 @@
           <w:rFonts w:asciiTheme="majorHAnsi" w:hAnsiTheme="majorHAnsi" w:cstheme="majorHAnsi"/>
           <w:color w:val="000000" w:themeColor="text1"/>
         </w:rPr>
-        <w:t xml:space="preserve">(Systems and AI) </w:t>
+        <w:t>(</w:t>
+      </w:r>
+      <w:r>
+        <w:rPr>
+          <w:rFonts w:asciiTheme="majorHAnsi" w:hAnsiTheme="majorHAnsi" w:cstheme="majorHAnsi"/>
+          <w:color w:val="000000" w:themeColor="text1"/>
+        </w:rPr>
+        <w:t>Systems</w:t>
+      </w:r>
+      <w:r>
+        <w:rPr>
+          <w:rFonts w:asciiTheme="majorHAnsi" w:hAnsiTheme="majorHAnsi" w:cstheme="majorHAnsi"/>
+          <w:color w:val="000000" w:themeColor="text1"/>
+        </w:rPr>
+        <w:t xml:space="preserve">) </w:t>
       </w:r>
       <w:r>
         <w:rPr>
@@ -200,7 +324,27 @@
           <w:rFonts w:asciiTheme="majorHAnsi" w:hAnsiTheme="majorHAnsi" w:cstheme="majorHAnsi"/>
           <w:color w:val="000000" w:themeColor="text1"/>
         </w:rPr>
-        <w:br/>
+        <w:t xml:space="preserve"> </w:t>
+      </w:r>
+      <w:r>
+        <w:rPr>
+          <w:rFonts w:asciiTheme="majorHAnsi" w:hAnsiTheme="majorHAnsi" w:cstheme="majorHAnsi"/>
+          <w:color w:val="000000" w:themeColor="text1"/>
+        </w:rPr>
+        <w:t>|</w:t>
+      </w:r>
+      <w:r>
+        <w:rPr>
+          <w:rFonts w:asciiTheme="majorHAnsi" w:hAnsiTheme="majorHAnsi" w:cstheme="majorHAnsi"/>
+          <w:color w:val="000000" w:themeColor="text1"/>
+        </w:rPr>
+        <w:t xml:space="preserve"> </w:t>
+      </w:r>
+      <w:r>
+        <w:rPr>
+          <w:rFonts w:asciiTheme="majorHAnsi" w:hAnsiTheme="majorHAnsi" w:cstheme="majorHAnsi"/>
+          <w:color w:val="000000" w:themeColor="text1"/>
+        </w:rPr>
         <w:t>GPA: 3.9</w:t>
       </w:r>
       <w:r>
@@ -264,44 +408,21 @@
           <w:rFonts w:asciiTheme="majorHAnsi" w:hAnsiTheme="majorHAnsi" w:cstheme="majorHAnsi"/>
           <w:color w:val="000000" w:themeColor="text1"/>
         </w:rPr>
-        <w:t>Valedictorian | Weighted GPA: 4.71/4.0</w:t>
+        <w:t xml:space="preserve">Valedictorian | </w:t>
       </w:r>
       <w:r>
         <w:rPr>
           <w:rFonts w:asciiTheme="majorHAnsi" w:hAnsiTheme="majorHAnsi" w:cstheme="majorHAnsi"/>
           <w:color w:val="000000" w:themeColor="text1"/>
         </w:rPr>
-        <w:br/>
-        <w:t xml:space="preserve">Varsity Cross Country &amp; Track </w:t>
+        <w:t xml:space="preserve">Weighted </w:t>
       </w:r>
       <w:r>
         <w:rPr>
           <w:rFonts w:asciiTheme="majorHAnsi" w:hAnsiTheme="majorHAnsi" w:cstheme="majorHAnsi"/>
           <w:color w:val="000000" w:themeColor="text1"/>
         </w:rPr>
-        <w:t>(</w:t>
-      </w:r>
-      <w:r>
-        <w:rPr>
-          <w:rFonts w:asciiTheme="majorHAnsi" w:hAnsiTheme="majorHAnsi" w:cstheme="majorHAnsi"/>
-          <w:color w:val="000000" w:themeColor="text1"/>
-        </w:rPr>
-        <w:t>Team Captain</w:t>
-      </w:r>
-      <w:r>
-        <w:rPr>
-          <w:rFonts w:asciiTheme="majorHAnsi" w:hAnsiTheme="majorHAnsi" w:cstheme="majorHAnsi"/>
-          <w:color w:val="000000" w:themeColor="text1"/>
-        </w:rPr>
-        <w:t>)</w:t>
-      </w:r>
-      <w:r>
-        <w:rPr>
-          <w:rFonts w:asciiTheme="majorHAnsi" w:hAnsiTheme="majorHAnsi" w:cstheme="majorHAnsi"/>
-          <w:color w:val="000000" w:themeColor="text1"/>
-        </w:rPr>
-        <w:br/>
-        <w:t>AP Scholar with Distinction</w:t>
+        <w:t>GPA: 4.71/4.0</w:t>
       </w:r>
     </w:p>
     <w:p>
@@ -342,6 +463,27 @@
           <w:rFonts w:asciiTheme="majorHAnsi" w:hAnsiTheme="majorHAnsi" w:cstheme="majorHAnsi"/>
           <w:color w:val="000000" w:themeColor="text1"/>
         </w:rPr>
+        <w:t>Objective</w:t>
+      </w:r>
+      <w:r>
+        <w:rPr>
+          <w:rFonts w:asciiTheme="majorHAnsi" w:hAnsiTheme="majorHAnsi" w:cstheme="majorHAnsi"/>
+          <w:color w:val="000000" w:themeColor="text1"/>
+        </w:rPr>
+        <w:t>-</w:t>
+      </w:r>
+      <w:r>
+        <w:rPr>
+          <w:rFonts w:asciiTheme="majorHAnsi" w:hAnsiTheme="majorHAnsi" w:cstheme="majorHAnsi"/>
+          <w:color w:val="000000" w:themeColor="text1"/>
+        </w:rPr>
+        <w:t xml:space="preserve">C, Swift, </w:t>
+      </w:r>
+      <w:r>
+        <w:rPr>
+          <w:rFonts w:asciiTheme="majorHAnsi" w:hAnsiTheme="majorHAnsi" w:cstheme="majorHAnsi"/>
+          <w:color w:val="000000" w:themeColor="text1"/>
+        </w:rPr>
         <w:t xml:space="preserve">Java, </w:t>
       </w:r>
       <w:r>
@@ -365,44 +507,14 @@
           <w:rFonts w:asciiTheme="majorHAnsi" w:hAnsiTheme="majorHAnsi" w:cstheme="majorHAnsi"/>
           <w:color w:val="000000" w:themeColor="text1"/>
         </w:rPr>
-        <w:t>Tools &amp; Frameworks: Git, Jira, QGIS, ArcGIS, YOLO (Object Detection)</w:t>
+        <w:t xml:space="preserve">Tools &amp; Frameworks: </w:t>
       </w:r>
       <w:r>
         <w:rPr>
           <w:rFonts w:asciiTheme="majorHAnsi" w:hAnsiTheme="majorHAnsi" w:cstheme="majorHAnsi"/>
           <w:color w:val="000000" w:themeColor="text1"/>
         </w:rPr>
-        <w:t>, Windows API</w:t>
-      </w:r>
-      <w:r>
-        <w:rPr>
-          <w:rFonts w:asciiTheme="majorHAnsi" w:hAnsiTheme="majorHAnsi" w:cstheme="majorHAnsi"/>
-          <w:color w:val="000000" w:themeColor="text1"/>
-        </w:rPr>
-        <w:t xml:space="preserve">, Pandas, </w:t>
-      </w:r>
-      <w:proofErr w:type="spellStart"/>
-      <w:r>
-        <w:rPr>
-          <w:rFonts w:asciiTheme="majorHAnsi" w:hAnsiTheme="majorHAnsi" w:cstheme="majorHAnsi"/>
-          <w:color w:val="000000" w:themeColor="text1"/>
-        </w:rPr>
-        <w:t>Numpy</w:t>
-      </w:r>
-      <w:proofErr w:type="spellEnd"/>
-      <w:r>
-        <w:rPr>
-          <w:rFonts w:asciiTheme="majorHAnsi" w:hAnsiTheme="majorHAnsi" w:cstheme="majorHAnsi"/>
-          <w:color w:val="000000" w:themeColor="text1"/>
-        </w:rPr>
-        <w:t>, Unix/Linux environment</w:t>
-      </w:r>
-      <w:r>
-        <w:rPr>
-          <w:rFonts w:asciiTheme="majorHAnsi" w:hAnsiTheme="majorHAnsi" w:cstheme="majorHAnsi"/>
-          <w:color w:val="000000" w:themeColor="text1"/>
-        </w:rPr>
-        <w:t>s</w:t>
+        <w:t>Git, Jira, Pandas, NumPy, PyTorch, Unix/Linux environments, QGIS, ArcGIS, Windows API</w:t>
       </w:r>
     </w:p>
     <w:p>
@@ -418,7 +530,7 @@
           <w:rFonts w:asciiTheme="majorHAnsi" w:hAnsiTheme="majorHAnsi" w:cstheme="majorHAnsi"/>
           <w:color w:val="000000" w:themeColor="text1"/>
         </w:rPr>
-        <w:t>Technical Areas: Algorithms &amp; Data Structures, Operating Systems, GIS Analysis, Software Development, Machine Learning (intro)</w:t>
+        <w:t>ML &amp; AI Tools: Claude, ChatGPT, SAM2, YOLO</w:t>
       </w:r>
     </w:p>
     <w:p>
@@ -434,7 +546,14 @@
           <w:rFonts w:asciiTheme="majorHAnsi" w:hAnsiTheme="majorHAnsi" w:cstheme="majorHAnsi"/>
           <w:color w:val="000000" w:themeColor="text1"/>
         </w:rPr>
-        <w:t>Other: Team management, CPR &amp; Lifeguard Certified</w:t>
+        <w:t xml:space="preserve">Technical Areas: </w:t>
+      </w:r>
+      <w:r>
+        <w:rPr>
+          <w:rFonts w:asciiTheme="majorHAnsi" w:hAnsiTheme="majorHAnsi" w:cstheme="majorHAnsi"/>
+          <w:color w:val="000000" w:themeColor="text1"/>
+        </w:rPr>
+        <w:t>Machine Learning, Computer Vision, Operating Systems, Systems Programming, Algorithms and Data Structures, Software Development, Computer Architecture</w:t>
       </w:r>
     </w:p>
     <w:p>
@@ -442,7 +561,9 @@
         <w:spacing w:line="240" w:lineRule="auto"/>
         <w:rPr>
           <w:rFonts w:asciiTheme="majorHAnsi" w:hAnsiTheme="majorHAnsi" w:cstheme="majorHAnsi"/>
+          <w:b/>
           <w:color w:val="000000" w:themeColor="text1"/>
+          <w:sz w:val="26"/>
         </w:rPr>
       </w:pPr>
       <w:r>
@@ -459,6 +580,7 @@
       <w:pPr>
         <w:pStyle w:val="NormalWeb"/>
         <w:rPr>
+          <w:rStyle w:val="Strong"/>
           <w:rFonts w:asciiTheme="majorHAnsi" w:hAnsiTheme="majorHAnsi" w:cstheme="majorHAnsi"/>
           <w:sz w:val="22"/>
           <w:szCs w:val="22"/>
@@ -471,7 +593,37 @@
           <w:sz w:val="22"/>
           <w:szCs w:val="22"/>
         </w:rPr>
-        <w:t>Boeing – C-17 Software Intern | 2025</w:t>
+        <w:t>Apple –</w:t>
+      </w:r>
+      <w:r>
+        <w:rPr>
+          <w:rStyle w:val="Strong"/>
+          <w:rFonts w:asciiTheme="majorHAnsi" w:hAnsiTheme="majorHAnsi" w:cstheme="majorHAnsi"/>
+          <w:b w:val="0"/>
+          <w:bCs w:val="0"/>
+          <w:sz w:val="22"/>
+          <w:szCs w:val="22"/>
+        </w:rPr>
+        <w:t xml:space="preserve"> </w:t>
+      </w:r>
+      <w:r>
+        <w:rPr>
+          <w:rFonts w:ascii="AppleSystemUIFont" w:hAnsi="AppleSystemUIFont" w:cs="AppleSystemUIFont"/>
+          <w:b/>
+          <w:bCs/>
+          <w:sz w:val="22"/>
+          <w:szCs w:val="22"/>
+        </w:rPr>
+        <w:t xml:space="preserve">SWE Intern on UI Frameworks Team </w:t>
+      </w:r>
+      <w:r>
+        <w:rPr>
+          <w:rStyle w:val="Strong"/>
+          <w:rFonts w:asciiTheme="majorHAnsi" w:hAnsiTheme="majorHAnsi" w:cstheme="majorHAnsi"/>
+          <w:sz w:val="22"/>
+          <w:szCs w:val="22"/>
+        </w:rPr>
+        <w:t>| 2026</w:t>
       </w:r>
     </w:p>
     <w:p>
@@ -493,7 +645,63 @@
           <w:sz w:val="22"/>
           <w:szCs w:val="22"/>
         </w:rPr>
-        <w:t>Enhanced cockpit simulation tools using C++ and Ada, improving both feature depth and user experience</w:t>
+        <w:t>Designed a launch syste</w:t>
+      </w:r>
+      <w:r>
+        <w:rPr>
+          <w:rFonts w:asciiTheme="majorHAnsi" w:hAnsiTheme="majorHAnsi" w:cstheme="majorHAnsi"/>
+          <w:sz w:val="22"/>
+          <w:szCs w:val="22"/>
+        </w:rPr>
+        <w:t xml:space="preserve">m, </w:t>
+      </w:r>
+      <w:r>
+        <w:rPr>
+          <w:rFonts w:asciiTheme="majorHAnsi" w:hAnsiTheme="majorHAnsi" w:cstheme="majorHAnsi"/>
+          <w:sz w:val="22"/>
+          <w:szCs w:val="22"/>
+        </w:rPr>
+        <w:t>allowing apps to distinguish launches involving UI from non-UI (headless/background) launches</w:t>
+      </w:r>
+      <w:r>
+        <w:rPr>
+          <w:rFonts w:asciiTheme="majorHAnsi" w:hAnsiTheme="majorHAnsi" w:cstheme="majorHAnsi"/>
+          <w:sz w:val="22"/>
+          <w:szCs w:val="22"/>
+        </w:rPr>
+        <w:t xml:space="preserve">, enabling both </w:t>
+      </w:r>
+      <w:r>
+        <w:rPr>
+          <w:rFonts w:asciiTheme="majorHAnsi" w:hAnsiTheme="majorHAnsi" w:cstheme="majorHAnsi"/>
+          <w:sz w:val="22"/>
+          <w:szCs w:val="22"/>
+        </w:rPr>
+        <w:t>first-party</w:t>
+      </w:r>
+      <w:r>
+        <w:rPr>
+          <w:rFonts w:asciiTheme="majorHAnsi" w:hAnsiTheme="majorHAnsi" w:cstheme="majorHAnsi"/>
+          <w:sz w:val="22"/>
+          <w:szCs w:val="22"/>
+        </w:rPr>
+        <w:t xml:space="preserve"> and </w:t>
+      </w:r>
+      <w:r>
+        <w:rPr>
+          <w:rFonts w:asciiTheme="majorHAnsi" w:hAnsiTheme="majorHAnsi" w:cstheme="majorHAnsi"/>
+          <w:sz w:val="22"/>
+          <w:szCs w:val="22"/>
+        </w:rPr>
+        <w:t>third-party</w:t>
+      </w:r>
+      <w:r>
+        <w:rPr>
+          <w:rFonts w:asciiTheme="majorHAnsi" w:hAnsiTheme="majorHAnsi" w:cstheme="majorHAnsi"/>
+          <w:sz w:val="22"/>
+          <w:szCs w:val="22"/>
+        </w:rPr>
+        <w:t xml:space="preserve"> app optimizations</w:t>
       </w:r>
     </w:p>
     <w:p>
@@ -515,7 +723,7 @@
           <w:sz w:val="22"/>
           <w:szCs w:val="22"/>
         </w:rPr>
-        <w:t>Diagnosed and resolved software bugs while expanding functionality within an established codebase</w:t>
+        <w:t>Identified unnecessary launch-time UI work through heap and call-stack analysis, then implemented the fixes in Objective-C and Swift</w:t>
       </w:r>
     </w:p>
     <w:p>
@@ -537,7 +745,23 @@
           <w:sz w:val="22"/>
           <w:szCs w:val="22"/>
         </w:rPr>
-        <w:t>Led a successful transition from Version 1 to Jira, coordinating efforts across four teams on a $280M flight deck replacement project for C-17 aircraft</w:t>
+        <w:t xml:space="preserve">Built an agent-pipeline </w:t>
+      </w:r>
+      <w:r>
+        <w:rPr>
+          <w:rFonts w:asciiTheme="majorHAnsi" w:hAnsiTheme="majorHAnsi" w:cstheme="majorHAnsi"/>
+          <w:sz w:val="22"/>
+          <w:szCs w:val="22"/>
+        </w:rPr>
+        <w:t>to run a</w:t>
+      </w:r>
+      <w:r>
+        <w:rPr>
+          <w:rFonts w:asciiTheme="majorHAnsi" w:hAnsiTheme="majorHAnsi" w:cstheme="majorHAnsi"/>
+          <w:sz w:val="22"/>
+          <w:szCs w:val="22"/>
+        </w:rPr>
+        <w:t xml:space="preserve"> 1,000+ trial A/B benchmark across two device generations, measuring a 10.7% reduction in non-UI app launch time</w:t>
       </w:r>
     </w:p>
     <w:p>
@@ -559,6 +783,136 @@
           <w:sz w:val="22"/>
           <w:szCs w:val="22"/>
         </w:rPr>
+        <w:t>Root-caused and fixed two iOS bugs</w:t>
+      </w:r>
+    </w:p>
+    <w:p>
+      <w:pPr>
+        <w:pStyle w:val="NormalWeb"/>
+        <w:numPr>
+          <w:ilvl w:val="0"/>
+          <w:numId w:val="17"/>
+        </w:numPr>
+        <w:rPr>
+          <w:rFonts w:asciiTheme="majorHAnsi" w:hAnsiTheme="majorHAnsi" w:cstheme="majorHAnsi"/>
+          <w:sz w:val="22"/>
+          <w:szCs w:val="22"/>
+        </w:rPr>
+      </w:pPr>
+      <w:r>
+        <w:rPr>
+          <w:rFonts w:asciiTheme="majorHAnsi" w:hAnsiTheme="majorHAnsi" w:cstheme="majorHAnsi"/>
+          <w:sz w:val="22"/>
+          <w:szCs w:val="22"/>
+        </w:rPr>
+        <w:t>Picked up Swift and Objective-C during the internship, quickly reaching independent contribution across multiple large-scale codebases</w:t>
+      </w:r>
+    </w:p>
+    <w:p>
+      <w:pPr>
+        <w:pStyle w:val="NormalWeb"/>
+        <w:rPr>
+          <w:rFonts w:asciiTheme="majorHAnsi" w:hAnsiTheme="majorHAnsi" w:cstheme="majorHAnsi"/>
+          <w:sz w:val="22"/>
+          <w:szCs w:val="22"/>
+        </w:rPr>
+      </w:pPr>
+      <w:r>
+        <w:rPr>
+          <w:rStyle w:val="Strong"/>
+          <w:rFonts w:asciiTheme="majorHAnsi" w:hAnsiTheme="majorHAnsi" w:cstheme="majorHAnsi"/>
+          <w:sz w:val="22"/>
+          <w:szCs w:val="22"/>
+        </w:rPr>
+        <w:t>Boeing – C-17 Software Intern | 2025</w:t>
+      </w:r>
+    </w:p>
+    <w:p>
+      <w:pPr>
+        <w:pStyle w:val="NormalWeb"/>
+        <w:numPr>
+          <w:ilvl w:val="0"/>
+          <w:numId w:val="17"/>
+        </w:numPr>
+        <w:rPr>
+          <w:rFonts w:asciiTheme="majorHAnsi" w:hAnsiTheme="majorHAnsi" w:cstheme="majorHAnsi"/>
+          <w:sz w:val="22"/>
+          <w:szCs w:val="22"/>
+        </w:rPr>
+      </w:pPr>
+      <w:r>
+        <w:rPr>
+          <w:rFonts w:asciiTheme="majorHAnsi" w:hAnsiTheme="majorHAnsi" w:cstheme="majorHAnsi"/>
+          <w:sz w:val="22"/>
+          <w:szCs w:val="22"/>
+        </w:rPr>
+        <w:t>Enhanced cockpit simulation tools using C++ and Ada, improving both feature depth and user experience</w:t>
+      </w:r>
+    </w:p>
+    <w:p>
+      <w:pPr>
+        <w:pStyle w:val="NormalWeb"/>
+        <w:numPr>
+          <w:ilvl w:val="0"/>
+          <w:numId w:val="17"/>
+        </w:numPr>
+        <w:rPr>
+          <w:rFonts w:asciiTheme="majorHAnsi" w:hAnsiTheme="majorHAnsi" w:cstheme="majorHAnsi"/>
+          <w:sz w:val="22"/>
+          <w:szCs w:val="22"/>
+        </w:rPr>
+      </w:pPr>
+      <w:r>
+        <w:rPr>
+          <w:rFonts w:asciiTheme="majorHAnsi" w:hAnsiTheme="majorHAnsi" w:cstheme="majorHAnsi"/>
+          <w:sz w:val="22"/>
+          <w:szCs w:val="22"/>
+        </w:rPr>
+        <w:t>Diagnosed and resolved software bugs while expanding functionality within an established codebase</w:t>
+      </w:r>
+    </w:p>
+    <w:p>
+      <w:pPr>
+        <w:pStyle w:val="NormalWeb"/>
+        <w:numPr>
+          <w:ilvl w:val="0"/>
+          <w:numId w:val="17"/>
+        </w:numPr>
+        <w:rPr>
+          <w:rFonts w:asciiTheme="majorHAnsi" w:hAnsiTheme="majorHAnsi" w:cstheme="majorHAnsi"/>
+          <w:sz w:val="22"/>
+          <w:szCs w:val="22"/>
+        </w:rPr>
+      </w:pPr>
+      <w:r>
+        <w:rPr>
+          <w:rFonts w:asciiTheme="majorHAnsi" w:hAnsiTheme="majorHAnsi" w:cstheme="majorHAnsi"/>
+          <w:sz w:val="22"/>
+          <w:szCs w:val="22"/>
+        </w:rPr>
+        <w:lastRenderedPageBreak/>
+        <w:t>Led a successful transition from Version 1 to Jira, coordinating efforts across four teams on a $280M flight deck replacement project for C-17 aircraft</w:t>
+      </w:r>
+    </w:p>
+    <w:p>
+      <w:pPr>
+        <w:pStyle w:val="NormalWeb"/>
+        <w:numPr>
+          <w:ilvl w:val="0"/>
+          <w:numId w:val="17"/>
+        </w:numPr>
+        <w:rPr>
+          <w:rFonts w:asciiTheme="majorHAnsi" w:hAnsiTheme="majorHAnsi" w:cstheme="majorHAnsi"/>
+          <w:sz w:val="22"/>
+          <w:szCs w:val="22"/>
+        </w:rPr>
+      </w:pPr>
+      <w:r>
+        <w:rPr>
+          <w:rFonts w:asciiTheme="majorHAnsi" w:hAnsiTheme="majorHAnsi" w:cstheme="majorHAnsi"/>
+          <w:sz w:val="22"/>
+          <w:szCs w:val="22"/>
+        </w:rPr>
         <w:t>Designed and implemented a spatial hashing algorithm to efficiently condense high-density data on the flight deck interface</w:t>
       </w:r>
     </w:p>
@@ -576,7 +930,23 @@
           <w:b/>
           <w:color w:val="000000" w:themeColor="text1"/>
         </w:rPr>
-        <w:t>Stanford CESTA (Center for Visual &amp; Textual Analysis) – Research Intern | 2025</w:t>
+        <w:t xml:space="preserve">Stanford CESTA (Center for </w:t>
+      </w:r>
+      <w:r>
+        <w:rPr>
+          <w:rFonts w:asciiTheme="majorHAnsi" w:hAnsiTheme="majorHAnsi" w:cstheme="majorHAnsi"/>
+          <w:b/>
+          <w:color w:val="000000" w:themeColor="text1"/>
+        </w:rPr>
+        <w:t>Spatial</w:t>
+      </w:r>
+      <w:r>
+        <w:rPr>
+          <w:rFonts w:asciiTheme="majorHAnsi" w:hAnsiTheme="majorHAnsi" w:cstheme="majorHAnsi"/>
+          <w:b/>
+          <w:color w:val="000000" w:themeColor="text1"/>
+        </w:rPr>
+        <w:t xml:space="preserve"> &amp; Textual Analysis) – Research Intern | 2025</w:t>
       </w:r>
     </w:p>
     <w:p>
@@ -656,7 +1026,7 @@
           <w:b/>
           <w:color w:val="000000" w:themeColor="text1"/>
         </w:rPr>
-        <w:t>Applied Matrix Theory (Stanford University) – Course Grader | 2025–</w:t>
+        <w:t>Applied Matrix Theory (Stanford University) – Course Grader | 2025</w:t>
       </w:r>
     </w:p>
     <w:p>
@@ -677,7 +1047,6 @@
           <w:rFonts w:asciiTheme="majorHAnsi" w:hAnsiTheme="majorHAnsi" w:cstheme="majorHAnsi"/>
           <w:color w:val="000000" w:themeColor="text1"/>
         </w:rPr>
-        <w:lastRenderedPageBreak/>
         <w:t>Assisted professor in evaluating coursework for 50+ students in advanced mathematics</w:t>
       </w:r>
     </w:p>
@@ -1042,9 +1411,7 @@
         <w:spacing w:after="0" w:line="270" w:lineRule="atLeast"/>
         <w:rPr>
           <w:rFonts w:asciiTheme="majorHAnsi" w:eastAsia="Times New Roman" w:hAnsiTheme="majorHAnsi" w:cstheme="majorHAnsi"/>
-          <w:color w:val="3B3B3B"/>
-          <w:sz w:val="18"/>
-          <w:szCs w:val="18"/>
+          <w:color w:val="000000" w:themeColor="text1"/>
         </w:rPr>
       </w:pPr>
       <w:r>
@@ -1054,7 +1421,7 @@
           <w:sz w:val="18"/>
           <w:szCs w:val="18"/>
         </w:rPr>
-        <w:t xml:space="preserve">          </w:t>
+        <w:t xml:space="preserve">  </w:t>
       </w:r>
     </w:p>
     <w:p>
@@ -1062,16 +1429,17 @@
         <w:spacing w:line="240" w:lineRule="auto"/>
         <w:rPr>
           <w:rFonts w:asciiTheme="majorHAnsi" w:hAnsiTheme="majorHAnsi" w:cstheme="majorHAnsi"/>
-          <w:color w:val="000000" w:themeColor="text1"/>
-        </w:rPr>
-      </w:pPr>
-      <w:r>
-        <w:rPr>
-          <w:rFonts w:asciiTheme="majorHAnsi" w:hAnsiTheme="majorHAnsi" w:cstheme="majorHAnsi"/>
           <w:b/>
           <w:color w:val="000000" w:themeColor="text1"/>
         </w:rPr>
-        <w:t>Pintos Operating System – Virtual Memory Implementation | 2025</w:t>
+      </w:pPr>
+      <w:r>
+        <w:rPr>
+          <w:rFonts w:asciiTheme="majorHAnsi" w:hAnsiTheme="majorHAnsi" w:cstheme="majorHAnsi"/>
+          <w:b/>
+          <w:color w:val="000000" w:themeColor="text1"/>
+        </w:rPr>
+        <w:t>Pintos Operating System Implementation | 2025</w:t>
       </w:r>
     </w:p>
     <w:p>
@@ -1079,7 +1447,7 @@
         <w:pStyle w:val="ListParagraph"/>
         <w:numPr>
           <w:ilvl w:val="0"/>
-          <w:numId w:val="15"/>
+          <w:numId w:val="19"/>
         </w:numPr>
         <w:spacing w:line="240" w:lineRule="auto"/>
         <w:rPr>
@@ -1089,42 +1457,19 @@
       </w:pPr>
       <w:r>
         <w:rPr>
-          <w:rFonts w:asciiTheme="majorHAnsi" w:hAnsiTheme="majorHAnsi" w:cstheme="majorHAnsi"/>
-          <w:color w:val="000000" w:themeColor="text1"/>
-        </w:rPr>
-        <w:t>Implemented supplemental page tables, frame allocation</w:t>
-      </w:r>
-      <w:r>
-        <w:rPr>
-          <w:rFonts w:asciiTheme="majorHAnsi" w:hAnsiTheme="majorHAnsi" w:cstheme="majorHAnsi"/>
-          <w:color w:val="000000" w:themeColor="text1"/>
-        </w:rPr>
-        <w:t>, threads, priority scheduling,</w:t>
-      </w:r>
-      <w:r>
-        <w:rPr>
-          <w:rFonts w:asciiTheme="majorHAnsi" w:hAnsiTheme="majorHAnsi" w:cstheme="majorHAnsi"/>
-          <w:color w:val="000000" w:themeColor="text1"/>
-        </w:rPr>
-        <w:t xml:space="preserve"> </w:t>
-      </w:r>
-      <w:r>
-        <w:rPr>
-          <w:rFonts w:asciiTheme="majorHAnsi" w:hAnsiTheme="majorHAnsi" w:cstheme="majorHAnsi"/>
-          <w:color w:val="000000" w:themeColor="text1"/>
-        </w:rPr>
-        <w:t xml:space="preserve">and virtual memory </w:t>
-      </w:r>
-      <w:r>
-        <w:rPr>
-          <w:rFonts w:asciiTheme="majorHAnsi" w:hAnsiTheme="majorHAnsi" w:cstheme="majorHAnsi"/>
-          <w:color w:val="000000" w:themeColor="text1"/>
-        </w:rPr>
-        <w:t>in C</w:t>
+          <w:rFonts w:cs="Calibri"/>
+        </w:rPr>
+        <w:lastRenderedPageBreak/>
+        <w:t>Implemented kernel-level threading, priority scheduling (with priority donation), and a multi-level feedback queue scheduler in C</w:t>
       </w:r>
     </w:p>
     <w:p>
       <w:pPr>
+        <w:pStyle w:val="ListParagraph"/>
+        <w:numPr>
+          <w:ilvl w:val="0"/>
+          <w:numId w:val="19"/>
+        </w:numPr>
         <w:spacing w:line="240" w:lineRule="auto"/>
         <w:rPr>
           <w:rFonts w:asciiTheme="majorHAnsi" w:hAnsiTheme="majorHAnsi" w:cstheme="majorHAnsi"/>
@@ -1133,16 +1478,18 @@
       </w:pPr>
       <w:r>
         <w:rPr>
-          <w:rFonts w:asciiTheme="majorHAnsi" w:hAnsiTheme="majorHAnsi" w:cstheme="majorHAnsi"/>
-          <w:b/>
-          <w:color w:val="000000" w:themeColor="text1"/>
-          <w:sz w:val="26"/>
-        </w:rPr>
-        <w:t>Coursework</w:t>
+          <w:rFonts w:cs="Calibri"/>
+        </w:rPr>
+        <w:t>Designed supplemental page tables, frame table, and swap table to support demand paging and virtual memory</w:t>
       </w:r>
     </w:p>
     <w:p>
       <w:pPr>
+        <w:pStyle w:val="ListParagraph"/>
+        <w:numPr>
+          <w:ilvl w:val="0"/>
+          <w:numId w:val="19"/>
+        </w:numPr>
         <w:spacing w:line="240" w:lineRule="auto"/>
         <w:rPr>
           <w:rFonts w:asciiTheme="majorHAnsi" w:hAnsiTheme="majorHAnsi" w:cstheme="majorHAnsi"/>
@@ -1151,10 +1498,53 @@
       </w:pPr>
       <w:r>
         <w:rPr>
+          <w:rFonts w:cs="Calibri"/>
+        </w:rPr>
+        <w:t>Improved</w:t>
+      </w:r>
+      <w:r>
+        <w:rPr>
+          <w:rFonts w:cs="Calibri"/>
+        </w:rPr>
+        <w:t xml:space="preserve"> page fault handler; implemented clock-based page eviction algorithm</w:t>
+      </w:r>
+    </w:p>
+    <w:p>
+      <w:pPr>
+        <w:pStyle w:val="ListParagraph"/>
+        <w:numPr>
+          <w:ilvl w:val="0"/>
+          <w:numId w:val="19"/>
+        </w:numPr>
+        <w:spacing w:line="240" w:lineRule="auto"/>
+        <w:rPr>
           <w:rFonts w:asciiTheme="majorHAnsi" w:hAnsiTheme="majorHAnsi" w:cstheme="majorHAnsi"/>
           <w:color w:val="000000" w:themeColor="text1"/>
         </w:rPr>
-        <w:t>Operating Systems Principles, Algorithms, Programming Abstractions, Computer Organization &amp; Systems, Probability for CS, Linear Algebra, Multivariable Calculus, Integral Calculus, Differential Equations, Fourier Methods</w:t>
+      </w:pPr>
+      <w:r>
+        <w:rPr>
+          <w:rFonts w:cs="Calibri"/>
+        </w:rPr>
+        <w:t>D</w:t>
+      </w:r>
+      <w:r>
+        <w:rPr>
+          <w:rFonts w:cs="Calibri"/>
+        </w:rPr>
+        <w:t>eveloped system call interfac</w:t>
+      </w:r>
+      <w:r>
+        <w:rPr>
+          <w:rFonts w:cs="Calibri"/>
+        </w:rPr>
+        <w:t xml:space="preserve">e, </w:t>
+      </w:r>
+      <w:r>
+        <w:rPr>
+          <w:rFonts w:cs="Calibri"/>
+        </w:rPr>
+        <w:t>safe user memory access validation</w:t>
       </w:r>
     </w:p>
     <w:p>
@@ -1202,7 +1592,7 @@
 </file>
 
 <file path=word/numbering.xml><?xml version="1.0" encoding="utf-8"?>
-<w:numbering xmlns:wpc="http://schemas.microsoft.com/office/word/2010/wordprocessingCanvas" xmlns:cx="http://schemas.microsoft.com/office/drawing/2014/chartex" xmlns:cx1="http://schemas.microsoft.com/office/drawing/2015/9/8/chartex" xmlns:cx2="http://schemas.microsoft.com/office/drawing/2015/10/21/chartex" xmlns:cx3="http://schemas.microsoft.com/office/drawing/2016/5/9/chartex" xmlns:cx4="http://schemas.microsoft.com/office/drawing/2016/5/10/chartex" xmlns:cx5="http://schemas.microsoft.com/office/drawing/2016/5/11/chartex" xmlns:cx6="http://schemas.microsoft.com/office/drawing/2016/5/12/chartex" xmlns:cx7="http://schemas.microsoft.com/office/drawing/2016/5/13/chartex" xmlns:cx8="http://schemas.microsoft.com/office/drawing/2016/5/14/chartex" xmlns:mc="http://schemas.openxmlformats.org/markup-compatibility/2006" xmlns:aink="http://schemas.microsoft.com/office/drawing/2016/ink" xmlns:am3d="http://schemas.microsoft.com/office/drawing/2017/model3d" xmlns:o="urn:schemas-microsoft-com:office:office" xmlns:oel="http://schemas.microsoft.com/office/2019/extlst" xmlns:r="http://schemas.openxmlformats.org/officeDocument/2006/relationships" xmlns:m="http://schemas.openxmlformats.org/officeDocument/2006/math" xmlns:v="urn:schemas-microsoft-com:vml" xmlns:wp14="http://schemas.microsoft.com/office/word/2010/wordprocessingDrawing" xmlns:wp="http://schemas.openxmlformats.org/drawingml/2006/wordprocessingDrawing" xmlns:w10="urn:schemas-microsoft-com:office:word" xmlns:w="http://schemas.openxmlformats.org/wordprocessingml/2006/main" xmlns:w14="http://schemas.microsoft.com/office/word/2010/wordml" xmlns:w15="http://schemas.microsoft.com/office/word/2012/wordml" xmlns:w16cex="http://schemas.microsoft.com/office/word/2018/wordml/cex" xmlns:w16cid="http://schemas.microsoft.com/office/word/2016/wordml/cid" xmlns:w16="http://schemas.microsoft.com/office/word/2018/wordml" xmlns:w16du="http://schemas.microsoft.com/office/word/2023/wordml/word16du" xmlns:w16sdtdh="http://schemas.microsoft.com/office/word/2020/wordml/sdtdatahash" xmlns:w16sdtfl="http://schemas.microsoft.com/office/word/2024/wordml/sdtformatlock" xmlns:w16se="http://schemas.microsoft.com/office/word/2015/wordml/symex" xmlns:wpg="http://schemas.microsoft.com/office/word/2010/wordprocessingGroup" xmlns:wpi="http://schemas.microsoft.com/office/word/2010/wordprocessingInk" xmlns:wne="http://schemas.microsoft.com/office/word/2006/wordml" xmlns:wps="http://schemas.microsoft.com/office/word/2010/wordprocessingShape" mc:Ignorable="w14 w15 w16se w16cid w16 w16cex w16sdtdh w16sdtfl w16du wp14">
+<w:numbering xmlns:wpc="http://schemas.microsoft.com/office/word/2010/wordprocessingCanvas" xmlns:cx="http://schemas.microsoft.com/office/drawing/2014/chartex" xmlns:cx1="http://schemas.microsoft.com/office/drawing/2015/9/8/chartex" xmlns:cx2="http://schemas.microsoft.com/office/drawing/2015/10/21/chartex" xmlns:cx3="http://schemas.microsoft.com/office/drawing/2016/5/9/chartex" xmlns:cx4="http://schemas.microsoft.com/office/drawing/2016/5/10/chartex" xmlns:cx5="http://schemas.microsoft.com/office/drawing/2016/5/11/chartex" xmlns:cx6="http://schemas.microsoft.com/office/drawing/2016/5/12/chartex" xmlns:cx7="http://schemas.microsoft.com/office/drawing/2016/5/13/chartex" xmlns:cx8="http://schemas.microsoft.com/office/drawing/2016/5/14/chartex" xmlns:mc="http://schemas.openxmlformats.org/markup-compatibility/2006" xmlns:m="http://schemas.openxmlformats.org/officeDocument/2006/math" xmlns:aink="http://schemas.microsoft.com/office/drawing/2016/ink" xmlns:am3d="http://schemas.microsoft.com/office/drawing/2017/model3d" xmlns:oel="http://schemas.microsoft.com/office/2019/extlst" xmlns:r="http://schemas.openxmlformats.org/officeDocument/2006/relationships" xmlns:wp14="http://schemas.microsoft.com/office/word/2010/wordprocessingDrawing" xmlns:wp="http://schemas.openxmlformats.org/drawingml/2006/wordprocessingDrawing" xmlns:wpg="http://schemas.microsoft.com/office/word/2010/wordprocessingGroup" xmlns:wpi="http://schemas.microsoft.com/office/word/2010/wordprocessingInk" xmlns:wps="http://schemas.microsoft.com/office/word/2010/wordprocessingShape" xmlns:o="urn:schemas-microsoft-com:office:office" xmlns:v="urn:schemas-microsoft-com:vml" xmlns:w10="urn:schemas-microsoft-com:office:word" xmlns:w="http://schemas.openxmlformats.org/wordprocessingml/2006/main" xmlns:w14="http://schemas.microsoft.com/office/word/2010/wordml" xmlns:w15="http://schemas.microsoft.com/office/word/2012/wordml" xmlns:w16cex="http://schemas.microsoft.com/office/word/2018/wordml/cex" xmlns:w16cid="http://schemas.microsoft.com/office/word/2016/wordml/cid" xmlns:w16="http://schemas.microsoft.com/office/word/2018/wordml" xmlns:w16sdtdh="http://schemas.microsoft.com/office/word/2020/wordml/sdtdatahash" xmlns:w16sdtfl="http://schemas.microsoft.com/office/word/2024/wordml/sdtformatlock" xmlns:w16se="http://schemas.microsoft.com/office/word/2015/wordml/symex" xmlns:w16du="http://schemas.microsoft.com/office/word/2023/wordml/word16du" xmlns:wne="http://schemas.microsoft.com/office/word/2006/wordml" mc:Ignorable="w14 w15 w16se w16cid w16 w16cex w16sdtdh w16sdtfl w16du wp14">
   <w:abstractNum w:abstractNumId="0" w15:restartNumberingAfterBreak="0">
     <w:nsid w:val="FFFFFF7C"/>
     <w:multiLevelType w:val="singleLevel"/>
@@ -1375,6 +1765,60 @@
     </w:lvl>
   </w:abstractNum>
   <w:abstractNum w:abstractNumId="9" w15:restartNumberingAfterBreak="0">
+    <w:nsid w:val="00000001"/>
+    <w:multiLevelType w:val="hybridMultilevel"/>
+    <w:tmpl w:val="FFFFFFFF"/>
+    <w:lvl w:ilvl="0" w:tplc="00000001">
+      <w:start w:val="1"/>
+      <w:numFmt w:val="bullet"/>
+      <w:lvlText w:val="•"/>
+      <w:lvlJc w:val="left"/>
+      <w:pPr>
+        <w:ind w:left="720" w:hanging="360"/>
+      </w:pPr>
+    </w:lvl>
+    <w:lvl w:ilvl="1" w:tplc="FFFFFFFF">
+      <w:numFmt w:val="decimal"/>
+      <w:lvlText w:val=""/>
+      <w:lvlJc w:val="left"/>
+    </w:lvl>
+    <w:lvl w:ilvl="2" w:tplc="FFFFFFFF">
+      <w:numFmt w:val="decimal"/>
+      <w:lvlText w:val=""/>
+      <w:lvlJc w:val="left"/>
+    </w:lvl>
+    <w:lvl w:ilvl="3" w:tplc="FFFFFFFF">
+      <w:numFmt w:val="decimal"/>
+      <w:lvlText w:val=""/>
+      <w:lvlJc w:val="left"/>
+    </w:lvl>
+    <w:lvl w:ilvl="4" w:tplc="FFFFFFFF">
+      <w:numFmt w:val="decimal"/>
+      <w:lvlText w:val=""/>
+      <w:lvlJc w:val="left"/>
+    </w:lvl>
+    <w:lvl w:ilvl="5" w:tplc="FFFFFFFF">
+      <w:numFmt w:val="decimal"/>
+      <w:lvlText w:val=""/>
+      <w:lvlJc w:val="left"/>
+    </w:lvl>
+    <w:lvl w:ilvl="6" w:tplc="FFFFFFFF">
+      <w:numFmt w:val="decimal"/>
+      <w:lvlText w:val=""/>
+      <w:lvlJc w:val="left"/>
+    </w:lvl>
+    <w:lvl w:ilvl="7" w:tplc="FFFFFFFF">
+      <w:numFmt w:val="decimal"/>
+      <w:lvlText w:val=""/>
+      <w:lvlJc w:val="left"/>
+    </w:lvl>
+    <w:lvl w:ilvl="8" w:tplc="FFFFFFFF">
+      <w:numFmt w:val="decimal"/>
+      <w:lvlText w:val=""/>
+      <w:lvlJc w:val="left"/>
+    </w:lvl>
+  </w:abstractNum>
+  <w:abstractNum w:abstractNumId="10" w15:restartNumberingAfterBreak="0">
     <w:nsid w:val="0F821BCA"/>
     <w:multiLevelType w:val="hybridMultilevel"/>
     <w:tmpl w:val="7F58EA24"/>
@@ -1487,10 +1931,10 @@
       </w:rPr>
     </w:lvl>
   </w:abstractNum>
-  <w:abstractNum w:abstractNumId="10" w15:restartNumberingAfterBreak="0">
+  <w:abstractNum w:abstractNumId="11" w15:restartNumberingAfterBreak="0">
     <w:nsid w:val="101B1718"/>
     <w:multiLevelType w:val="hybridMultilevel"/>
-    <w:tmpl w:val="A0E6194A"/>
+    <w:tmpl w:val="77E29E30"/>
     <w:lvl w:ilvl="0" w:tplc="04090001">
       <w:start w:val="1"/>
       <w:numFmt w:val="bullet"/>
@@ -1600,7 +2044,7 @@
       </w:rPr>
     </w:lvl>
   </w:abstractNum>
-  <w:abstractNum w:abstractNumId="11" w15:restartNumberingAfterBreak="0">
+  <w:abstractNum w:abstractNumId="12" w15:restartNumberingAfterBreak="0">
     <w:nsid w:val="14E41C86"/>
     <w:multiLevelType w:val="hybridMultilevel"/>
     <w:tmpl w:val="0090CDB0"/>
@@ -1713,7 +2157,7 @@
       </w:rPr>
     </w:lvl>
   </w:abstractNum>
-  <w:abstractNum w:abstractNumId="12" w15:restartNumberingAfterBreak="0">
+  <w:abstractNum w:abstractNumId="13" w15:restartNumberingAfterBreak="0">
     <w:nsid w:val="17D17353"/>
     <w:multiLevelType w:val="hybridMultilevel"/>
     <w:tmpl w:val="02F6E986"/>
@@ -1826,7 +2270,7 @@
       </w:rPr>
     </w:lvl>
   </w:abstractNum>
-  <w:abstractNum w:abstractNumId="13" w15:restartNumberingAfterBreak="0">
+  <w:abstractNum w:abstractNumId="14" w15:restartNumberingAfterBreak="0">
     <w:nsid w:val="1DDE7603"/>
     <w:multiLevelType w:val="hybridMultilevel"/>
     <w:tmpl w:val="58121DB6"/>
@@ -1939,7 +2383,7 @@
       </w:rPr>
     </w:lvl>
   </w:abstractNum>
-  <w:abstractNum w:abstractNumId="14" w15:restartNumberingAfterBreak="0">
+  <w:abstractNum w:abstractNumId="15" w15:restartNumberingAfterBreak="0">
     <w:nsid w:val="20965F87"/>
     <w:multiLevelType w:val="hybridMultilevel"/>
     <w:tmpl w:val="222E98EE"/>
@@ -2052,7 +2496,7 @@
       </w:rPr>
     </w:lvl>
   </w:abstractNum>
-  <w:abstractNum w:abstractNumId="15" w15:restartNumberingAfterBreak="0">
+  <w:abstractNum w:abstractNumId="16" w15:restartNumberingAfterBreak="0">
     <w:nsid w:val="2CD63F6C"/>
     <w:multiLevelType w:val="hybridMultilevel"/>
     <w:tmpl w:val="B726B678"/>
@@ -2165,7 +2609,7 @@
       </w:rPr>
     </w:lvl>
   </w:abstractNum>
-  <w:abstractNum w:abstractNumId="16" w15:restartNumberingAfterBreak="0">
+  <w:abstractNum w:abstractNumId="17" w15:restartNumberingAfterBreak="0">
     <w:nsid w:val="383A5475"/>
     <w:multiLevelType w:val="multilevel"/>
     <w:tmpl w:val="A254E20C"/>
@@ -2314,7 +2758,7 @@
       </w:rPr>
     </w:lvl>
   </w:abstractNum>
-  <w:abstractNum w:abstractNumId="17" w15:restartNumberingAfterBreak="0">
+  <w:abstractNum w:abstractNumId="18" w15:restartNumberingAfterBreak="0">
     <w:nsid w:val="6C98633A"/>
     <w:multiLevelType w:val="hybridMultilevel"/>
     <w:tmpl w:val="DCC644A0"/>
@@ -2427,7 +2871,7 @@
       </w:rPr>
     </w:lvl>
   </w:abstractNum>
-  <w:abstractNum w:abstractNumId="18" w15:restartNumberingAfterBreak="0">
+  <w:abstractNum w:abstractNumId="19" w15:restartNumberingAfterBreak="0">
     <w:nsid w:val="75F75563"/>
     <w:multiLevelType w:val="hybridMultilevel"/>
     <w:tmpl w:val="181C49EC"/>
@@ -2568,40 +3012,43 @@
     <w:abstractNumId w:val="0"/>
   </w:num>
   <w:num w:numId="10" w16cid:durableId="805900585">
-    <w:abstractNumId w:val="9"/>
+    <w:abstractNumId w:val="10"/>
   </w:num>
   <w:num w:numId="11" w16cid:durableId="2046980711">
+    <w:abstractNumId w:val="14"/>
+  </w:num>
+  <w:num w:numId="12" w16cid:durableId="375282040">
     <w:abstractNumId w:val="13"/>
   </w:num>
-  <w:num w:numId="12" w16cid:durableId="375282040">
+  <w:num w:numId="13" w16cid:durableId="1080062149">
     <w:abstractNumId w:val="12"/>
   </w:num>
-  <w:num w:numId="13" w16cid:durableId="1080062149">
+  <w:num w:numId="14" w16cid:durableId="657151171">
+    <w:abstractNumId w:val="19"/>
+  </w:num>
+  <w:num w:numId="15" w16cid:durableId="515002954">
+    <w:abstractNumId w:val="15"/>
+  </w:num>
+  <w:num w:numId="16" w16cid:durableId="841554414">
+    <w:abstractNumId w:val="18"/>
+  </w:num>
+  <w:num w:numId="17" w16cid:durableId="945817746">
+    <w:abstractNumId w:val="17"/>
+  </w:num>
+  <w:num w:numId="18" w16cid:durableId="104156432">
+    <w:abstractNumId w:val="16"/>
+  </w:num>
+  <w:num w:numId="19" w16cid:durableId="1216964962">
     <w:abstractNumId w:val="11"/>
   </w:num>
-  <w:num w:numId="14" w16cid:durableId="657151171">
-    <w:abstractNumId w:val="18"/>
-  </w:num>
-  <w:num w:numId="15" w16cid:durableId="515002954">
-    <w:abstractNumId w:val="14"/>
-  </w:num>
-  <w:num w:numId="16" w16cid:durableId="841554414">
-    <w:abstractNumId w:val="17"/>
-  </w:num>
-  <w:num w:numId="17" w16cid:durableId="945817746">
-    <w:abstractNumId w:val="16"/>
-  </w:num>
-  <w:num w:numId="18" w16cid:durableId="104156432">
-    <w:abstractNumId w:val="15"/>
-  </w:num>
-  <w:num w:numId="19" w16cid:durableId="1216964962">
-    <w:abstractNumId w:val="10"/>
+  <w:num w:numId="20" w16cid:durableId="591016406">
+    <w:abstractNumId w:val="9"/>
   </w:num>
 </w:numbering>
 </file>
 
 <file path=word/styles.xml><?xml version="1.0" encoding="utf-8"?>
-<w:styles xmlns:mc="http://schemas.openxmlformats.org/markup-compatibility/2006" xmlns:r="http://schemas.openxmlformats.org/officeDocument/2006/relationships" xmlns:w="http://schemas.openxmlformats.org/wordprocessingml/2006/main" xmlns:w14="http://schemas.microsoft.com/office/word/2010/wordml" xmlns:w15="http://schemas.microsoft.com/office/word/2012/wordml" xmlns:w16cex="http://schemas.microsoft.com/office/word/2018/wordml/cex" xmlns:w16cid="http://schemas.microsoft.com/office/word/2016/wordml/cid" xmlns:w16="http://schemas.microsoft.com/office/word/2018/wordml" xmlns:w16du="http://schemas.microsoft.com/office/word/2023/wordml/word16du" xmlns:w16sdtdh="http://schemas.microsoft.com/office/word/2020/wordml/sdtdatahash" xmlns:w16sdtfl="http://schemas.microsoft.com/office/word/2024/wordml/sdtformatlock" xmlns:w16se="http://schemas.microsoft.com/office/word/2015/wordml/symex" mc:Ignorable="w14 w15 w16se w16cid w16 w16cex w16sdtdh w16sdtfl w16du">
+<w:styles xmlns:mc="http://schemas.openxmlformats.org/markup-compatibility/2006" xmlns:r="http://schemas.openxmlformats.org/officeDocument/2006/relationships" xmlns:w="http://schemas.openxmlformats.org/wordprocessingml/2006/main" xmlns:w14="http://schemas.microsoft.com/office/word/2010/wordml" xmlns:w15="http://schemas.microsoft.com/office/word/2012/wordml" xmlns:w16cex="http://schemas.microsoft.com/office/word/2018/wordml/cex" xmlns:w16cid="http://schemas.microsoft.com/office/word/2016/wordml/cid" xmlns:w16="http://schemas.microsoft.com/office/word/2018/wordml" xmlns:w16sdtdh="http://schemas.microsoft.com/office/word/2020/wordml/sdtdatahash" xmlns:w16sdtfl="http://schemas.microsoft.com/office/word/2024/wordml/sdtformatlock" xmlns:w16se="http://schemas.microsoft.com/office/word/2015/wordml/symex" xmlns:w16du="http://schemas.microsoft.com/office/word/2023/wordml/word16du" mc:Ignorable="w14 w15 w16se w16cid w16 w16cex w16sdtdh w16sdtfl w16du">
   <w:docDefaults>
     <w:rPrDefault>
       <w:rPr>
@@ -14010,7 +14457,6 @@
     <w:name w:val="Normal (Web)"/>
     <w:basedOn w:val="Normal"/>
     <w:uiPriority w:val="99"/>
-    <w:semiHidden/>
     <w:unhideWhenUsed/>
     <w:rsid w:val="00E1041A"/>
     <w:pPr>
@@ -14032,6 +14478,19 @@
     <w:rPr>
       <w:color w:val="800080" w:themeColor="followedHyperlink"/>
       <w:u w:val="single"/>
+    </w:rPr>
+  </w:style>
+  <w:style w:type="character" w:styleId="HTMLCode">
+    <w:name w:val="HTML Code"/>
+    <w:basedOn w:val="DefaultParagraphFont"/>
+    <w:uiPriority w:val="99"/>
+    <w:semiHidden/>
+    <w:unhideWhenUsed/>
+    <w:rsid w:val="00E833E5"/>
+    <w:rPr>
+      <w:rFonts w:ascii="Courier New" w:eastAsia="Times New Roman" w:hAnsi="Courier New" w:cs="Courier New"/>
+      <w:sz w:val="20"/>
+      <w:szCs w:val="20"/>
     </w:rPr>
   </w:style>
 </w:styles>

</xml_diff>